<commit_message>
minor changes to word template
</commit_message>
<xml_diff>
--- a/templates/word-template/reference.docx
+++ b/templates/word-template/reference.docx
@@ -1748,12 +1748,7 @@
     </w:p>
     <w:p>
       <w:pPr>
-        <w:pStyle w:val="Heading1"/>
-        <w:numPr>
-          <w:ilvl w:val="0"/>
-          <w:numId w:val="0"/>
-        </w:numPr>
-        <w:ind w:left="902" w:hanging="902"/>
+        <w:pStyle w:val="heading1-unnumbered"/>
       </w:pPr>
       <w:bookmarkStart w:id="0" w:name="_Toc316629711"/>
       <w:bookmarkStart w:id="1" w:name="_Toc172211680"/>
@@ -2748,7 +2743,7 @@
     </w:p>
     <w:p>
       <w:pPr>
-        <w:pStyle w:val="Heading1"/>
+        <w:pStyle w:val="heading1-unnumbered"/>
         <w:sectPr>
           <w:pgSz w:w="11906" w:h="16838" w:code="9"/>
           <w:pgMar w:top="1418" w:right="1418" w:bottom="1418" w:left="1985" w:header="709" w:footer="709" w:gutter="0"/>
@@ -6229,7 +6224,7 @@
   <w:abstractNum w:abstractNumId="25" w15:restartNumberingAfterBreak="0">
     <w:nsid w:val="6669298B"/>
     <w:multiLevelType w:val="multilevel"/>
-    <w:tmpl w:val="ECBEE8DC"/>
+    <w:tmpl w:val="95E8897A"/>
     <w:lvl w:ilvl="0">
       <w:start w:val="1"/>
       <w:numFmt w:val="decimal"/>
@@ -7982,6 +7977,34 @@
       <w:lang w:val="de-DE" w:eastAsia="de-DE"/>
     </w:rPr>
   </w:style>
+  <w:style w:type="paragraph" w:customStyle="1" w:styleId="heading1-unnumbered">
+    <w:name w:val="heading1-unnumbered"/>
+    <w:basedOn w:val="Heading1"/>
+    <w:link w:val="heading1-unnumberedChar"/>
+    <w:qFormat/>
+    <w:rsid w:val="0044656B"/>
+    <w:pPr>
+      <w:numPr>
+        <w:numId w:val="0"/>
+      </w:numPr>
+    </w:pPr>
+  </w:style>
+  <w:style w:type="character" w:customStyle="1" w:styleId="heading1-unnumberedChar">
+    <w:name w:val="heading1-unnumbered Char"/>
+    <w:basedOn w:val="Heading1Char"/>
+    <w:link w:val="heading1-unnumbered"/>
+    <w:rsid w:val="0044656B"/>
+    <w:rPr>
+      <w:rFonts w:cs="Arial"/>
+      <w:b/>
+      <w:bCs/>
+      <w:caps/>
+      <w:kern w:val="32"/>
+      <w:sz w:val="28"/>
+      <w:szCs w:val="28"/>
+      <w:lang w:eastAsia="de-DE"/>
+    </w:rPr>
+  </w:style>
 </w:styles>
 </file>
 
@@ -8269,20 +8292,6 @@
 </file>
 
 <file path=customXml/item1.xml><?xml version="1.0" encoding="utf-8"?>
-<p:properties xmlns:p="http://schemas.microsoft.com/office/2006/metadata/properties" xmlns:xsi="http://www.w3.org/2001/XMLSchema-instance">
-  <documentManagement>
-    <SharedWithUsers xmlns="5137f360-fa0c-4b2e-81d9-0f1d032534dd">
-      <UserInfo>
-        <DisplayName>Lutz Nathanael</DisplayName>
-        <AccountId>125</AccountId>
-        <AccountType/>
-      </UserInfo>
-    </SharedWithUsers>
-  </documentManagement>
-</p:properties>
-</file>
-
-<file path=customXml/item2.xml><?xml version="1.0" encoding="utf-8"?>
 <b:Sources xmlns:b="http://schemas.openxmlformats.org/officeDocument/2006/bibliography" xmlns="http://schemas.openxmlformats.org/officeDocument/2006/bibliography" SelectedStyle="\APA.XSL" StyleName="APA">
   <b:Source>
     <b:Tag>Cina</b:Tag>
@@ -8368,7 +8377,107 @@
 </b:Sources>
 </file>
 
+<file path=customXml/item2.xml><?xml version="1.0" encoding="utf-8"?>
+<p:properties xmlns:p="http://schemas.microsoft.com/office/2006/metadata/properties" xmlns:xsi="http://www.w3.org/2001/XMLSchema-instance">
+  <documentManagement>
+    <SharedWithUsers xmlns="5137f360-fa0c-4b2e-81d9-0f1d032534dd">
+      <UserInfo>
+        <DisplayName>Lutz Nathanael</DisplayName>
+        <AccountId>125</AccountId>
+        <AccountType/>
+      </UserInfo>
+    </SharedWithUsers>
+  </documentManagement>
+</p:properties>
+</file>
+
 <file path=customXml/item3.xml><?xml version="1.0" encoding="utf-8"?>
+<b:Sources xmlns:b="http://schemas.openxmlformats.org/officeDocument/2006/bibliography" xmlns="http://schemas.openxmlformats.org/officeDocument/2006/bibliography" SelectedStyle="\APA.XSL" StyleName="APA">
+  <b:Source>
+    <b:Tag>Cina</b:Tag>
+    <b:SourceType>ArticleInAPeriodical</b:SourceType>
+    <b:Guid>{EFD64E2B-DBD8-4A5A-A741-A1444D929DC2}</b:Guid>
+    <b:Author>
+      <b:Author>
+        <b:NameList>
+          <b:Person>
+            <b:Last>Cina-Tschumi</b:Last>
+            <b:First>B</b:First>
+          </b:Person>
+        </b:NameList>
+      </b:Author>
+    </b:Author>
+    <b:Title>Evidenz-basierte Pflege am Beispiel von Kälteanwendungen nach ausgewähltenorthopädischen Eingriffen – eine Literaturstudie</b:Title>
+    <b:PeriodicalTitle>Pflege</b:PeriodicalTitle>
+    <b:Year>2007</b:Year>
+    <b:Pages>258-267</b:Pages>
+    <b:Issue>20</b:Issue>
+    <b:RefOrder>2</b:RefOrder>
+  </b:Source>
+  <b:Source>
+    <b:Tag>BFH</b:Tag>
+    <b:SourceType>InternetSite</b:SourceType>
+    <b:Guid>{51B1224E-7633-421A-B9B6-8252A0A038BF}</b:Guid>
+    <b:Author>
+      <b:Author>
+        <b:Corporate>Berner Fachhochschule</b:Corporate>
+      </b:Author>
+    </b:Author>
+    <b:Title>Richtlinien über den Umgang mit Plagiaten an der Berner Fachhochschule</b:Title>
+    <b:URL>http://www.bfh.ch/bfh/rechtlichegrundlagen/studienreglemente.html</b:URL>
+    <b:Year>2009</b:Year>
+    <b:DayAccessed>12</b:DayAccessed>
+    <b:YearAccessed>2009</b:YearAccessed>
+    <b:MonthAccessed>September</b:MonthAccessed>
+    <b:RefOrder>1</b:RefOrder>
+  </b:Source>
+  <b:Source>
+    <b:Tag>Gie06</b:Tag>
+    <b:SourceType>BookSection</b:SourceType>
+    <b:Guid>{8DA91BDD-DE76-4055-9936-8A3B0B476BE3}</b:Guid>
+    <b:Author>
+      <b:Author>
+        <b:NameList>
+          <b:Person>
+            <b:Last>Gieseke</b:Last>
+            <b:First>M.</b:First>
+          </b:Person>
+          <b:Person>
+            <b:Last>Matscheko</b:Last>
+            <b:First>N.</b:First>
+          </b:Person>
+        </b:NameList>
+      </b:Author>
+      <b:BookAuthor>
+        <b:NameList>
+          <b:Person>
+            <b:Last>Heuwinkel-Otter</b:Last>
+            <b:First>A.</b:First>
+          </b:Person>
+          <b:Person>
+            <b:Last>Nümann-Dulke</b:Last>
+            <b:First>A.</b:First>
+          </b:Person>
+          <b:Person>
+            <b:Last>Matscheko</b:Last>
+            <b:First>N.</b:First>
+          </b:Person>
+        </b:NameList>
+      </b:BookAuthor>
+    </b:Author>
+    <b:Title>Pflegequalität</b:Title>
+    <b:Year>2006</b:Year>
+    <b:BookTitle>Menschen pflegen</b:BookTitle>
+    <b:Pages>113-132</b:Pages>
+    <b:City>Heidelberg</b:City>
+    <b:Publisher>Springer</b:Publisher>
+    <b:Volume>1</b:Volume>
+    <b:RefOrder>3</b:RefOrder>
+  </b:Source>
+</b:Sources>
+</file>
+
+<file path=customXml/item4.xml><?xml version="1.0" encoding="utf-8"?>
 <?mso-contentType ?>
 <FormTemplates xmlns="http://schemas.microsoft.com/sharepoint/v3/contenttype/forms">
   <Display>DocumentLibraryForm</Display>
@@ -8377,7 +8486,7 @@
 </FormTemplates>
 </file>
 
-<file path=customXml/item4.xml><?xml version="1.0" encoding="utf-8"?>
+<file path=customXml/item5.xml><?xml version="1.0" encoding="utf-8"?>
 <ct:contentTypeSchema xmlns:ct="http://schemas.microsoft.com/office/2006/metadata/contentType" xmlns:ma="http://schemas.microsoft.com/office/2006/metadata/properties/metaAttributes" ct:_="" ma:_="" ma:contentTypeName="Dokument" ma:contentTypeID="0x010100813895525622BD4C9458B78387D5182C" ma:contentTypeVersion="13" ma:contentTypeDescription="Ein neues Dokument erstellen." ma:contentTypeScope="" ma:versionID="4c08fc8f302e082c268dd4f4a9a63675">
   <xsd:schema xmlns:xsd="http://www.w3.org/2001/XMLSchema" xmlns:xs="http://www.w3.org/2001/XMLSchema" xmlns:p="http://schemas.microsoft.com/office/2006/metadata/properties" xmlns:ns2="4a9d1253-9b07-49ce-83ef-ecaaf0492256" xmlns:ns3="5137f360-fa0c-4b2e-81d9-0f1d032534dd" targetNamespace="http://schemas.microsoft.com/office/2006/metadata/properties" ma:root="true" ma:fieldsID="79799332e6fe650a84a8c6f0ec1cc0c7" ns2:_="" ns3:_="">
     <xsd:import namespace="4a9d1253-9b07-49ce-83ef-ecaaf0492256"/>
@@ -8600,92 +8709,6 @@
 </ct:contentTypeSchema>
 </file>
 
-<file path=customXml/item5.xml><?xml version="1.0" encoding="utf-8"?>
-<b:Sources xmlns:b="http://schemas.openxmlformats.org/officeDocument/2006/bibliography" xmlns="http://schemas.openxmlformats.org/officeDocument/2006/bibliography" SelectedStyle="\APA.XSL" StyleName="APA">
-  <b:Source>
-    <b:Tag>Cina</b:Tag>
-    <b:SourceType>ArticleInAPeriodical</b:SourceType>
-    <b:Guid>{EFD64E2B-DBD8-4A5A-A741-A1444D929DC2}</b:Guid>
-    <b:Author>
-      <b:Author>
-        <b:NameList>
-          <b:Person>
-            <b:Last>Cina-Tschumi</b:Last>
-            <b:First>B</b:First>
-          </b:Person>
-        </b:NameList>
-      </b:Author>
-    </b:Author>
-    <b:Title>Evidenz-basierte Pflege am Beispiel von Kälteanwendungen nach ausgewähltenorthopädischen Eingriffen – eine Literaturstudie</b:Title>
-    <b:PeriodicalTitle>Pflege</b:PeriodicalTitle>
-    <b:Year>2007</b:Year>
-    <b:Pages>258-267</b:Pages>
-    <b:Issue>20</b:Issue>
-    <b:RefOrder>2</b:RefOrder>
-  </b:Source>
-  <b:Source>
-    <b:Tag>BFH</b:Tag>
-    <b:SourceType>InternetSite</b:SourceType>
-    <b:Guid>{51B1224E-7633-421A-B9B6-8252A0A038BF}</b:Guid>
-    <b:Author>
-      <b:Author>
-        <b:Corporate>Berner Fachhochschule</b:Corporate>
-      </b:Author>
-    </b:Author>
-    <b:Title>Richtlinien über den Umgang mit Plagiaten an der Berner Fachhochschule</b:Title>
-    <b:URL>http://www.bfh.ch/bfh/rechtlichegrundlagen/studienreglemente.html</b:URL>
-    <b:Year>2009</b:Year>
-    <b:DayAccessed>12</b:DayAccessed>
-    <b:YearAccessed>2009</b:YearAccessed>
-    <b:MonthAccessed>September</b:MonthAccessed>
-    <b:RefOrder>1</b:RefOrder>
-  </b:Source>
-  <b:Source>
-    <b:Tag>Gie06</b:Tag>
-    <b:SourceType>BookSection</b:SourceType>
-    <b:Guid>{8DA91BDD-DE76-4055-9936-8A3B0B476BE3}</b:Guid>
-    <b:Author>
-      <b:Author>
-        <b:NameList>
-          <b:Person>
-            <b:Last>Gieseke</b:Last>
-            <b:First>M.</b:First>
-          </b:Person>
-          <b:Person>
-            <b:Last>Matscheko</b:Last>
-            <b:First>N.</b:First>
-          </b:Person>
-        </b:NameList>
-      </b:Author>
-      <b:BookAuthor>
-        <b:NameList>
-          <b:Person>
-            <b:Last>Heuwinkel-Otter</b:Last>
-            <b:First>A.</b:First>
-          </b:Person>
-          <b:Person>
-            <b:Last>Nümann-Dulke</b:Last>
-            <b:First>A.</b:First>
-          </b:Person>
-          <b:Person>
-            <b:Last>Matscheko</b:Last>
-            <b:First>N.</b:First>
-          </b:Person>
-        </b:NameList>
-      </b:BookAuthor>
-    </b:Author>
-    <b:Title>Pflegequalität</b:Title>
-    <b:Year>2006</b:Year>
-    <b:BookTitle>Menschen pflegen</b:BookTitle>
-    <b:Pages>113-132</b:Pages>
-    <b:City>Heidelberg</b:City>
-    <b:Publisher>Springer</b:Publisher>
-    <b:Volume>1</b:Volume>
-    <b:RefOrder>3</b:RefOrder>
-  </b:Source>
-</b:Sources>
-</file>
-
 <file path=customXml/item6.xml><?xml version="1.0" encoding="utf-8"?>
 <b:Sources xmlns:b="http://schemas.openxmlformats.org/officeDocument/2006/bibliography" xmlns="http://schemas.openxmlformats.org/officeDocument/2006/bibliography" SelectedStyle="\APA.XSL" StyleName="APA">
   <b:Source>
@@ -8773,6 +8796,14 @@
 </file>
 
 <file path=customXml/itemProps1.xml><?xml version="1.0" encoding="utf-8"?>
+<ds:datastoreItem xmlns:ds="http://schemas.openxmlformats.org/officeDocument/2006/customXml" ds:itemID="{54CDC8B7-C5DF-4371-9624-DE6980E51345}">
+  <ds:schemaRefs>
+    <ds:schemaRef ds:uri="http://schemas.openxmlformats.org/officeDocument/2006/bibliography"/>
+  </ds:schemaRefs>
+</ds:datastoreItem>
+</file>
+
+<file path=customXml/itemProps2.xml><?xml version="1.0" encoding="utf-8"?>
 <ds:datastoreItem xmlns:ds="http://schemas.openxmlformats.org/officeDocument/2006/customXml" ds:itemID="{2C13B81A-1182-42A4-86C6-E39B6F4DE2B3}">
   <ds:schemaRefs>
     <ds:schemaRef ds:uri="http://schemas.microsoft.com/office/2006/metadata/properties"/>
@@ -8781,7 +8812,7 @@
 </ds:datastoreItem>
 </file>
 
-<file path=customXml/itemProps2.xml><?xml version="1.0" encoding="utf-8"?>
+<file path=customXml/itemProps3.xml><?xml version="1.0" encoding="utf-8"?>
 <ds:datastoreItem xmlns:ds="http://schemas.openxmlformats.org/officeDocument/2006/customXml" ds:itemID="{C719EC45-D2F9-4C97-85D1-AEDFE860004D}">
   <ds:schemaRefs>
     <ds:schemaRef ds:uri="http://schemas.openxmlformats.org/officeDocument/2006/bibliography"/>
@@ -8789,7 +8820,7 @@
 </ds:datastoreItem>
 </file>
 
-<file path=customXml/itemProps3.xml><?xml version="1.0" encoding="utf-8"?>
+<file path=customXml/itemProps4.xml><?xml version="1.0" encoding="utf-8"?>
 <ds:datastoreItem xmlns:ds="http://schemas.openxmlformats.org/officeDocument/2006/customXml" ds:itemID="{6EACDB63-E280-4376-8F27-16FBE69C1E17}">
   <ds:schemaRefs>
     <ds:schemaRef ds:uri="http://schemas.microsoft.com/sharepoint/v3/contenttype/forms"/>
@@ -8797,7 +8828,7 @@
 </ds:datastoreItem>
 </file>
 
-<file path=customXml/itemProps4.xml><?xml version="1.0" encoding="utf-8"?>
+<file path=customXml/itemProps5.xml><?xml version="1.0" encoding="utf-8"?>
 <ds:datastoreItem xmlns:ds="http://schemas.openxmlformats.org/officeDocument/2006/customXml" ds:itemID="{FE54BA80-F24C-4C04-A3B2-7CE47A022DE3}">
   <ds:schemaRefs>
     <ds:schemaRef ds:uri="http://schemas.microsoft.com/office/2006/metadata/contentType"/>
@@ -8816,18 +8847,10 @@
 </ds:datastoreItem>
 </file>
 
-<file path=customXml/itemProps5.xml><?xml version="1.0" encoding="utf-8"?>
+<file path=customXml/itemProps6.xml><?xml version="1.0" encoding="utf-8"?>
 <ds:datastoreItem xmlns:ds="http://schemas.openxmlformats.org/officeDocument/2006/customXml" ds:itemID="{F02FB088-DB5F-47FF-8DBD-74DD09538403}">
   <ds:schemaRefs>
     <ds:schemaRef ds:uri="http://schemas.openxmlformats.org/officeDocument/2006/bibliography"/>
   </ds:schemaRefs>
 </ds:datastoreItem>
-</file>
-
-<file path=customXml/itemProps6.xml><?xml version="1.0" encoding="utf-8"?>
-<ds:datastoreItem xmlns:ds="http://schemas.openxmlformats.org/officeDocument/2006/customXml" ds:itemID="{54CDC8B7-C5DF-4371-9624-DE6980E51345}">
-  <ds:schemaRefs>
-    <ds:schemaRef ds:uri="http://schemas.openxmlformats.org/officeDocument/2006/bibliography"/>
-  </ds:schemaRefs>
-</ds:datastoreItem>
 </file>
</xml_diff>